<commit_message>
v4.1: Sync all files — presentations, docs, scripts, dashboard
</commit_message>
<xml_diff>
--- a/📚 DOCUMENTATION/EXECUTION_PLAN_v3.2.docx
+++ b/📚 DOCUMENTATION/EXECUTION_PLAN_v3.2.docx
@@ -28,7 +28,7 @@
           <w:color w:val="2E75B6"/>
           <w:sz w:val="48"/>
         </w:rPr>
-        <w:t>EXECUTION PLAN v3.1</w:t>
+        <w:t>EXECUTION PLAN v3.2</w:t>
       </w:r>
     </w:p>
     <w:p/>
@@ -44,7 +44,7 @@
         <w:t>Apollo + Notion + Python + GitHub Actions</w:t>
         <w:br/>
         <w:br/>
-        <w:t>27 March 2026</w:t>
+        <w:t>28 March 2026</w:t>
         <w:br/>
         <w:t>Version 3.1 — Execution-First Approach</w:t>
         <w:br/>
@@ -9585,7 +9585,7 @@
               <w:rPr>
                 <w:sz w:val="20"/>
               </w:rPr>
-              <w:t>Phase 3: ENRICH</w:t>
+              <w:t>Phase 3: ENRICH ✔ COMPLETE</w:t>
             </w:r>
           </w:p>
         </w:tc>
@@ -9598,7 +9598,7 @@
               <w:rPr>
                 <w:sz w:val="20"/>
               </w:rPr>
-              <w:t>Job Postings sync + Job Change detection + Intent Trend</w:t>
+              <w:t>Job Postings Intent + Auto Sequences + Analytics + Calibrator</w:t>
             </w:r>
           </w:p>
         </w:tc>
@@ -9611,7 +9611,63 @@
               <w:rPr>
                 <w:sz w:val="20"/>
               </w:rPr>
-              <w:t>Signals enriching lead intelligence</w:t>
+              <w:t>16-step pipeline active. Sequences running. Engagement syncing.</w:t>
+            </w:r>
+          </w:p>
+        </w:tc>
+      </w:tr>
+      <w:tr>
+        <w:tc>
+          <w:tcPr>
+            <w:tcW w:type="dxa" w:w="1134"/>
+          </w:tcPr>
+          <w:p>
+            <w:r>
+              <w:rPr>
+                <w:sz w:val="20"/>
+              </w:rPr>
+              <w:t>Week 4 (Mar 2026)</w:t>
+            </w:r>
+          </w:p>
+        </w:tc>
+        <w:tc>
+          <w:tcPr>
+            <w:tcW w:type="dxa" w:w="1701"/>
+          </w:tcPr>
+          <w:p>
+            <w:r>
+              <w:rPr>
+                <w:sz w:val="20"/>
+                <w:b/>
+                <w:color w:val="E8771A"/>
+              </w:rPr>
+              <w:t>Phase 3.5: MEET ✔ COMPLETE</w:t>
+            </w:r>
+          </w:p>
+        </w:tc>
+        <w:tc>
+          <w:tcPr>
+            <w:tcW w:type="dxa" w:w="2835"/>
+          </w:tcPr>
+          <w:p>
+            <w:r>
+              <w:rPr>
+                <w:sz w:val="20"/>
+              </w:rPr>
+              <w:t>Meeting Intelligence: meeting_tracker + meeting_analyzer + opportunity_manager</w:t>
+            </w:r>
+          </w:p>
+        </w:tc>
+        <w:tc>
+          <w:tcPr>
+            <w:tcW w:type="dxa" w:w="2551"/>
+          </w:tcPr>
+          <w:p>
+            <w:r>
+              <w:rPr>
+                <w:sz w:val="20"/>
+              </w:rPr>
+              <w:t>Meetings → Opportunities. Revenue loop closes. 17 scripts total.</w:t>
             </w:r>
           </w:p>
         </w:tc>
@@ -9685,7 +9741,7 @@
         </w:rPr>
         <w:br/>
         <w:br/>
-        <w:t>Document Version: 3.1  |  Date: 27 March 2026  |  Status: APPROVED FOR EXECUTION</w:t>
+        <w:t>Document Version: 3.2  |  Date: 28 March 2026  |  Phase 3.5: COMPLETE  |  Status: ACTIVE</w:t>
       </w:r>
     </w:p>
     <w:sectPr>

</xml_diff>